<commit_message>
fix(p01c): honest DOCX font manifests and refresh review evidence
DOCX exports now record font_resource_hashes with fonts_embedded=false and Noto family names on runs. Traceability marks P1-E05/E06/E07 PARTIAL/DEFERRED, and standalone screenshots remove the Next.js issue badge.

Co-authored-by: Cursor <cursoragent@cursor.com>
</commit_message>
<xml_diff>
--- a/artifacts/review-bundles/P01C-2026-08-07/samples/p01c_fixture_a4.docx
+++ b/artifacts/review-bundles/P01C-2026-08-07/samples/p01c_fixture_a4.docx
@@ -8,21 +8,37 @@
         <w:jc w:val="left"/>
       </w:pPr>
       <w:r>
+        <w:rPr>
+          <w:rFonts w:ascii="Noto Sans" w:hAnsi="Noto Sans"/>
+          <w:sz w:val="22"/>
+        </w:rPr>
         <w:t>P01C Structural Learning-Page Fixture</w:t>
       </w:r>
     </w:p>
     <w:p>
       <w:r>
+        <w:rPr>
+          <w:rFonts w:ascii="Noto Sans" w:hAnsi="Noto Sans"/>
+          <w:sz w:val="22"/>
+        </w:rPr>
         <w:t>Status: SOURCE_BLOCKED</w:t>
       </w:r>
     </w:p>
     <w:p>
       <w:r>
+        <w:rPr>
+          <w:rFonts w:ascii="Noto Sans" w:hAnsi="Noto Sans"/>
+          <w:sz w:val="22"/>
+        </w:rPr>
         <w:t>TEST FIXTURE — NOT APPROVED DEVOTIONAL CONTENT</w:t>
       </w:r>
     </w:p>
     <w:p>
       <w:r>
+        <w:rPr>
+          <w:rFonts w:ascii="Noto Sans" w:hAnsi="Noto Sans"/>
+          <w:sz w:val="22"/>
+        </w:rPr>
         <w:t>Page size: a4</w:t>
       </w:r>
     </w:p>
@@ -31,22 +47,37 @@
         <w:pStyle w:val="Heading2"/>
       </w:pPr>
       <w:r>
+        <w:rPr>
+          <w:rFonts w:ascii="Noto Sans" w:hAnsi="Noto Sans"/>
+          <w:sz w:val="22"/>
+        </w:rPr>
         <w:t>Stanza 1</w:t>
       </w:r>
     </w:p>
     <w:p>
-      <w:pPr/>
       <w:r>
+        <w:rPr>
+          <w:rFonts w:ascii="Noto Sans Devanagari" w:hAnsi="Noto Sans Devanagari" w:eastAsia="Noto Sans Devanagari" w:cs="Noto Sans Devanagari"/>
+          <w:sz w:val="22"/>
+        </w:rPr>
         <w:t>परीक्षण श्लोक एक — TEST FIXTURE</w:t>
       </w:r>
     </w:p>
     <w:p>
       <w:r>
+        <w:rPr>
+          <w:rFonts w:ascii="Noto Sans" w:hAnsi="Noto Sans"/>
+          <w:sz w:val="22"/>
+        </w:rPr>
         <w:t>parīkṣaṇa śloka eka — TEST FIXTURE</w:t>
       </w:r>
     </w:p>
     <w:p>
       <w:r>
+        <w:rPr>
+          <w:rFonts w:ascii="Noto Sans" w:hAnsi="Noto Sans"/>
+          <w:sz w:val="22"/>
+        </w:rPr>
         <w:t>Structural stanza one. TEST FIXTURE — NOT APPROVED DEVOTIONAL CONTENT</w:t>
       </w:r>
     </w:p>
@@ -55,28 +86,48 @@
         <w:pStyle w:val="Heading2"/>
       </w:pPr>
       <w:r>
+        <w:rPr>
+          <w:rFonts w:ascii="Noto Sans" w:hAnsi="Noto Sans"/>
+          <w:sz w:val="22"/>
+        </w:rPr>
         <w:t>Stanza 2</w:t>
       </w:r>
     </w:p>
     <w:p>
-      <w:pPr/>
       <w:r>
+        <w:rPr>
+          <w:rFonts w:ascii="Noto Sans Devanagari" w:hAnsi="Noto Sans Devanagari" w:eastAsia="Noto Sans Devanagari" w:cs="Noto Sans Devanagari"/>
+          <w:sz w:val="22"/>
+        </w:rPr>
         <w:t>परीक्षण श्लोक द्वि — TEST FIXTURE</w:t>
       </w:r>
     </w:p>
     <w:p>
       <w:r>
+        <w:rPr>
+          <w:rFonts w:ascii="Noto Sans" w:hAnsi="Noto Sans"/>
+          <w:sz w:val="22"/>
+        </w:rPr>
         <w:t>parīkṣaṇa śloka dvi — TEST FIXTURE</w:t>
       </w:r>
     </w:p>
     <w:p>
       <w:r>
+        <w:rPr>
+          <w:rFonts w:ascii="Noto Sans" w:hAnsi="Noto Sans"/>
+          <w:sz w:val="22"/>
+        </w:rPr>
         <w:t>Structural stanza two. TEST FIXTURE — NOT APPROVED DEVOTIONAL CONTENT</w:t>
       </w:r>
     </w:p>
     <w:p>
       <w:r>
-        <w:t>Export is study-neutral (canonical text only).</w:t>
+        <w:rPr>
+          <w:rFonts w:ascii="Noto Sans" w:hAnsi="Noto Sans"/>
+          <w:color w:val="333333"/>
+          <w:sz w:val="22"/>
+        </w:rPr>
+        <w:t>Export is study-neutral (canonical text only). DOCX OOXML font embedding is deferred; runs request Noto Sans / Noto Sans Devanagari.</w:t>
       </w:r>
     </w:p>
     <w:sectPr>
@@ -452,6 +503,9 @@
     <w:name w:val="Normal"/>
     <w:qFormat/>
     <w:rsid w:val="00FC693F"/>
+    <w:rPr>
+      <w:rFonts w:ascii="Noto Sans" w:hAnsi="Noto Sans" w:eastAsia="Noto Sans Devanagari"/>
+    </w:rPr>
   </w:style>
   <w:style w:type="paragraph" w:styleId="Header">
     <w:name w:val="header"/>

</xml_diff>